<commit_message>
correcciones finales trabajo de grado
</commit_message>
<xml_diff>
--- a/docs expo/entregables/FactuGest - Diagramas de Casos de Uso.docx
+++ b/docs expo/entregables/FactuGest - Diagramas de Casos de Uso.docx
@@ -134,7 +134,7 @@
           <w:b w:val="0"/>
           <w:i w:val="0"/>
         </w:rPr>
-        <w:t>SERVICIO NACIONAL DE APRENDIZAJE — SENA</w:t>
+        <w:t>SERVICIO NACIONAL DE APRENDIZAJE (SENA)</w:t>
       </w:r>
     </w:p>
     <w:p>
@@ -249,7 +249,7 @@
           <w:b w:val="0"/>
           <w:i w:val="0"/>
         </w:rPr>
-        <w:t>Este documento reúne los diagramas de casos de uso de FactuGest. Un caso de uso describe un objetivo que un actor persigue con el sistema y el resultado observable que obtiene; no describe una pantalla ni una operación sobre la base de datos. Por esa razón los cincuenta y seis casos que aquí se presentan no coinciden en número con los ochenta y dos requisitos funcionales especificados: un caso como «gestionar impuestos» cubre el registro, la consulta, la actualización y la eliminación, que para quien usa el sistema son un mismo propósito.</w:t>
+        <w:t>Este documento reúne los diagramas de casos de uso de FactuGest. Un caso de uso describe un objetivo que un actor persigue con el sistema y el resultado observable que obtiene; no describe una pantalla ni una operación sobre la base de datos. Por esa razón los cincuenta y seis casos que aquí se presentan no coinciden en número con los ochenta y dos requisitos funcionales especificados, porque un caso como «gestionar impuestos» cubre el registro, la consulta, la actualización y la eliminación, que para quien usa el sistema son un mismo propósito.</w:t>
       </w:r>
     </w:p>
     <w:p>
@@ -263,7 +263,7 @@
           <w:b w:val="0"/>
           <w:i w:val="0"/>
         </w:rPr>
-        <w:t>Los diagramas se elaboraron contra el sistema construido, no contra el planteamiento inicial del proyecto. Entre uno y otro el alcance cambió: FactuGest dejó de ser un facturador para una sola empresa y pasó a ser un proveedor que emite por cuenta de terceros mediante una API. Ese cambio introdujo actores que antes no existían —el sistema cliente, en primer lugar— y módulos completos como el de clientes integrados y el de consumo y planes.</w:t>
+        <w:t>Los diagramas se elaboraron contra el sistema construido, no contra el planteamiento inicial del proyecto. Entre uno y otro el alcance cambió: FactuGest dejó de ser un facturador para una sola empresa y pasó a ser un proveedor que emite por cuenta de terceros mediante una API. Ese cambio introdujo actores que antes no existían, como el sistema cliente, y módulos completos como el de clientes integrados y el de consumo y planes.</w:t>
       </w:r>
     </w:p>
     <w:p>
@@ -276,6 +276,7 @@
     </w:p>
     <w:p>
       <w:pPr>
+        <w:keepNext/>
         <w:spacing w:line="480" w:lineRule="auto" w:before="0" w:after="0"/>
         <w:ind w:firstLine="0"/>
         <w:jc w:val="left"/>
@@ -289,6 +290,7 @@
     </w:p>
     <w:p>
       <w:pPr>
+        <w:keepNext/>
         <w:spacing w:line="480" w:lineRule="auto" w:before="0" w:after="0"/>
         <w:ind w:firstLine="0"/>
         <w:jc w:val="left"/>
@@ -808,11 +810,12 @@
           <w:b w:val="0"/>
           <w:i w:val="0"/>
         </w:rPr>
-        <w:t>El sistema reconoce seis actores. Cuatro corresponden a los roles del panel y se ordenan jerárquicamente; los otros dos no son personas que lo operen: uno es el sistema externo que consume la API y el otro es quien recibe el documento emitido.</w:t>
+        <w:t>El sistema reconoce seis actores. Cuatro corresponden a los roles del panel y se ordenan jerárquicamente; los otros dos no son personas que lo operen, ya que uno es el sistema externo que consume la API y el otro es quien recibe el documento emitido.</w:t>
       </w:r>
     </w:p>
     <w:p>
       <w:pPr>
+        <w:keepNext/>
         <w:spacing w:line="480" w:lineRule="auto" w:before="0" w:after="0"/>
         <w:ind w:firstLine="0"/>
         <w:jc w:val="left"/>
@@ -826,6 +829,7 @@
     </w:p>
     <w:p>
       <w:pPr>
+        <w:keepNext/>
         <w:spacing w:line="480" w:lineRule="auto" w:before="0" w:after="0"/>
         <w:ind w:firstLine="0"/>
         <w:jc w:val="left"/>
@@ -1107,7 +1111,7 @@
                 <w:b w:val="0"/>
                 <w:sz w:val="20"/>
               </w:rPr>
-              <w:t>Sistema externo —punto de venta, ERP o aplicación propia de la empresa integrada— que consume la API con su llave para emitir y consultar documentos. Es un actor no humano y es el que origina la mayor parte de la operación.</w:t>
+              <w:t>Sistema externo, sea punto de venta, ERP o aplicación propia de la empresa integrada, que consume la API con su llave para emitir y consultar documentos. Es un actor no humano y es el que origina la mayor parte de la operación.</w:t>
             </w:r>
           </w:p>
         </w:tc>
@@ -1148,7 +1152,7 @@
                 <w:b w:val="0"/>
                 <w:sz w:val="20"/>
               </w:rPr>
-              <w:t>Destinatario del documento electrónico. No accede al sistema: recibe el PDF y el XML en su correo. Se representa como actor porque es quien recibe el resultado del caso de uso, aunque nunca lo inicie.</w:t>
+              <w:t>Destinatario del documento electrónico. No accede al sistema y recibe el PDF y el XML en su correo. Se representa como actor porque es quien recibe el resultado del caso de uso, aunque nunca lo inicie.</w:t>
             </w:r>
           </w:p>
         </w:tc>
@@ -1206,6 +1210,7 @@
     </w:p>
     <w:p>
       <w:pPr>
+        <w:keepNext/>
         <w:spacing w:line="480" w:lineRule="auto" w:before="0" w:after="0"/>
         <w:ind w:firstLine="0"/>
         <w:jc w:val="left"/>
@@ -1219,6 +1224,7 @@
     </w:p>
     <w:p>
       <w:pPr>
+        <w:keepNext/>
         <w:spacing w:line="480" w:lineRule="auto" w:before="0" w:after="0"/>
         <w:ind w:firstLine="0"/>
         <w:jc w:val="left"/>
@@ -1233,6 +1239,7 @@
     </w:p>
     <w:p>
       <w:pPr>
+        <w:keepNext/>
         <w:spacing w:line="480" w:lineRule="auto" w:before="0" w:after="0"/>
         <w:ind w:firstLine="0"/>
         <w:jc w:val="center"/>
@@ -1240,7 +1247,7 @@
       <w:r>
         <w:drawing>
           <wp:inline xmlns:a="http://schemas.openxmlformats.org/drawingml/2006/main" xmlns:pic="http://schemas.openxmlformats.org/drawingml/2006/picture">
-            <wp:extent cx="5943600" cy="5316882"/>
+            <wp:extent cx="5943600" cy="5511029"/>
             <wp:docPr id="1" name="Picture 1"/>
             <wp:cNvGraphicFramePr>
               <a:graphicFrameLocks noChangeAspect="1"/>
@@ -1261,7 +1268,7 @@
                   <pic:spPr>
                     <a:xfrm>
                       <a:off x="0" y="0"/>
-                      <a:ext cx="5943600" cy="5316882"/>
+                      <a:ext cx="5943600" cy="5511029"/>
                     </a:xfrm>
                     <a:prstGeom prst="rect"/>
                   </pic:spPr>
@@ -1310,7 +1317,7 @@
           <w:b w:val="0"/>
           <w:i w:val="0"/>
         </w:rPr>
-        <w:t>Dos observaciones sobre lo que el diagrama muestra. La primera es que el sistema cliente participa en la emisión de documentos igual que un cajero: para la plataforma, una venta registrada por una persona y una enviada por el punto de venta de un tercero recorren el mismo camino. La segunda es que el comprador aparece recibiendo un documento sin iniciar ningún caso, lo que corresponde a su situación real: es el destinatario de la operación y no tiene acceso al sistema.</w:t>
+        <w:t>Dos observaciones sobre lo que el diagrama muestra. La primera es que el sistema cliente participa en la emisión de documentos igual que un cajero, porque para la plataforma, una venta registrada por una persona y una enviada por el punto de venta de un tercero recorren el mismo camino. La segunda es que el comprador aparece recibiendo un documento sin iniciar ningún caso, lo que corresponde a su situación real, ya que es el destinatario de la operación y no tiene acceso al sistema.</w:t>
       </w:r>
     </w:p>
     <w:p>
@@ -1333,7 +1340,7 @@
           <w:b w:val="0"/>
           <w:i w:val="0"/>
         </w:rPr>
-        <w:t>Los ocho diagramas siguientes corresponden a los ocho módulos funcionales especificados en el documento de requisitos. La correspondencia es intencional: cada caso de uso indica los requisitos que cubre, de modo que pueda comprobarse que ningún requisito quedó sin caso y que ningún caso describe algo que no fue especificado.</w:t>
+        <w:t>Los ocho diagramas siguientes corresponden a los ocho módulos funcionales especificados en el documento de requisitos. La correspondencia es intencional, porque cada caso de uso indica los requisitos que cubre, de modo que pueda comprobarse que ningún requisito quedó sin caso y que ningún caso describe algo que no fue especificado.</w:t>
       </w:r>
     </w:p>
     <w:p>
@@ -1342,7 +1349,7 @@
         <w:pageBreakBefore/>
       </w:pPr>
       <w:r>
-        <w:t>4.1 DCU-01 — Gestión de clientes API</w:t>
+        <w:t>4.1 DCU-01. Gestión de clientes API</w:t>
       </w:r>
     </w:p>
     <w:p>
@@ -1356,11 +1363,12 @@
           <w:b w:val="0"/>
           <w:i w:val="0"/>
         </w:rPr>
-        <w:t>Recoge la administración de las empresas integradas. La generación de la llave se modela como caso incluido porque no ocurre por decisión aparte: registrar un cliente sin llave no lo deja en condiciones de emitir.</w:t>
+        <w:t>Recoge la administración de las empresas integradas. La generación de la llave se modela como caso incluido porque no ocurre por decisión aparte, ya que registrar un cliente sin llave no lo deja en condiciones de emitir.</w:t>
       </w:r>
     </w:p>
     <w:p>
       <w:pPr>
+        <w:keepNext/>
         <w:spacing w:line="480" w:lineRule="auto" w:before="0" w:after="0"/>
         <w:ind w:firstLine="0"/>
         <w:jc w:val="left"/>
@@ -1374,6 +1382,7 @@
     </w:p>
     <w:p>
       <w:pPr>
+        <w:keepNext/>
         <w:spacing w:line="480" w:lineRule="auto" w:before="0" w:after="0"/>
         <w:ind w:firstLine="0"/>
         <w:jc w:val="left"/>
@@ -1383,11 +1392,12 @@
           <w:b w:val="0"/>
           <w:i/>
         </w:rPr>
-        <w:t>Diagrama de casos de uso: gestión de clientes API</w:t>
+        <w:t>Diagrama de casos de uso del módulo de gestión de clientes API</w:t>
       </w:r>
     </w:p>
     <w:p>
       <w:pPr>
+        <w:keepNext/>
         <w:spacing w:line="480" w:lineRule="auto" w:before="0" w:after="0"/>
         <w:ind w:firstLine="0"/>
         <w:jc w:val="center"/>
@@ -1395,7 +1405,7 @@
       <w:r>
         <w:drawing>
           <wp:inline xmlns:a="http://schemas.openxmlformats.org/drawingml/2006/main" xmlns:pic="http://schemas.openxmlformats.org/drawingml/2006/picture">
-            <wp:extent cx="5943600" cy="3317517"/>
+            <wp:extent cx="5943600" cy="3664936"/>
             <wp:docPr id="2" name="Picture 2"/>
             <wp:cNvGraphicFramePr>
               <a:graphicFrameLocks noChangeAspect="1"/>
@@ -1416,7 +1426,7 @@
                   <pic:spPr>
                     <a:xfrm>
                       <a:off x="0" y="0"/>
-                      <a:ext cx="5943600" cy="3317517"/>
+                      <a:ext cx="5943600" cy="3664936"/>
                     </a:xfrm>
                     <a:prstGeom prst="rect"/>
                   </pic:spPr>
@@ -1456,6 +1466,7 @@
     </w:p>
     <w:p>
       <w:pPr>
+        <w:keepNext/>
         <w:spacing w:line="480" w:lineRule="auto" w:before="0" w:after="0"/>
         <w:ind w:firstLine="0"/>
         <w:jc w:val="left"/>
@@ -1469,6 +1480,7 @@
     </w:p>
     <w:p>
       <w:pPr>
+        <w:keepNext/>
         <w:spacing w:line="480" w:lineRule="auto" w:before="0" w:after="0"/>
         <w:ind w:firstLine="0"/>
         <w:jc w:val="left"/>
@@ -2299,7 +2311,7 @@
         <w:rPr>
           <w:sz w:val="20"/>
         </w:rPr>
-        <w:t>Elaboración propia. Los casos sin actor son casos incluidos: el sistema los ejecuta como parte de otro y nadie los inicia por separado.</w:t>
+        <w:t>Elaboración propia. Los casos sin actor son casos incluidos y el sistema los ejecuta como parte de otro y nadie los inicia por separado.</w:t>
       </w:r>
     </w:p>
     <w:p>
@@ -2315,7 +2327,7 @@
         <w:pageBreakBefore/>
       </w:pPr>
       <w:r>
-        <w:t>4.2 DCU-02 — Gestión de documentos electrónicos</w:t>
+        <w:t>4.2 DCU-02. Gestión de documentos electrónicos</w:t>
       </w:r>
     </w:p>
     <w:p>
@@ -2329,11 +2341,12 @@
           <w:b w:val="0"/>
           <w:i w:val="0"/>
         </w:rPr>
-        <w:t>Es el núcleo del sistema. Los tres casos de emisión comparten los pasos que hacen válido a un documento —el consecutivo, el cálculo y los dos archivos—, que por eso se modelan como casos incluidos y no se repiten en cada uno. El envío al comprador se modela como extensión: ocurre después de que la emisión terminó y su resultado no condiciona el del documento.</w:t>
+        <w:t>Es el núcleo del sistema. Los tres casos de emisión comparten los pasos que hacen válido a un documento, que son el consecutivo, el cálculo y los dos archivos, y por eso se modelan como casos incluidos y no se repiten en cada uno. El envío al comprador se modela como extensión, pues ocurre después de que la emisión terminó y su resultado no condiciona el del documento.</w:t>
       </w:r>
     </w:p>
     <w:p>
       <w:pPr>
+        <w:keepNext/>
         <w:spacing w:line="480" w:lineRule="auto" w:before="0" w:after="0"/>
         <w:ind w:firstLine="0"/>
         <w:jc w:val="left"/>
@@ -2347,6 +2360,7 @@
     </w:p>
     <w:p>
       <w:pPr>
+        <w:keepNext/>
         <w:spacing w:line="480" w:lineRule="auto" w:before="0" w:after="0"/>
         <w:ind w:firstLine="0"/>
         <w:jc w:val="left"/>
@@ -2356,11 +2370,12 @@
           <w:b w:val="0"/>
           <w:i/>
         </w:rPr>
-        <w:t>Diagrama de casos de uso: gestión de documentos electrónicos</w:t>
+        <w:t>Diagrama de casos de uso del módulo de gestión de documentos electrónicos</w:t>
       </w:r>
     </w:p>
     <w:p>
       <w:pPr>
+        <w:keepNext/>
         <w:spacing w:line="480" w:lineRule="auto" w:before="0" w:after="0"/>
         <w:ind w:firstLine="0"/>
         <w:jc w:val="center"/>
@@ -2368,7 +2383,7 @@
       <w:r>
         <w:drawing>
           <wp:inline xmlns:a="http://schemas.openxmlformats.org/drawingml/2006/main" xmlns:pic="http://schemas.openxmlformats.org/drawingml/2006/picture">
-            <wp:extent cx="5943600" cy="3062061"/>
+            <wp:extent cx="5943600" cy="3245989"/>
             <wp:docPr id="3" name="Picture 3"/>
             <wp:cNvGraphicFramePr>
               <a:graphicFrameLocks noChangeAspect="1"/>
@@ -2389,7 +2404,7 @@
                   <pic:spPr>
                     <a:xfrm>
                       <a:off x="0" y="0"/>
-                      <a:ext cx="5943600" cy="3062061"/>
+                      <a:ext cx="5943600" cy="3245989"/>
                     </a:xfrm>
                     <a:prstGeom prst="rect"/>
                   </pic:spPr>
@@ -2429,6 +2444,7 @@
     </w:p>
     <w:p>
       <w:pPr>
+        <w:keepNext/>
         <w:spacing w:line="480" w:lineRule="auto" w:before="0" w:after="0"/>
         <w:ind w:firstLine="0"/>
         <w:jc w:val="left"/>
@@ -2442,6 +2458,7 @@
     </w:p>
     <w:p>
       <w:pPr>
+        <w:keepNext/>
         <w:spacing w:line="480" w:lineRule="auto" w:before="0" w:after="0"/>
         <w:ind w:firstLine="0"/>
         <w:jc w:val="left"/>
@@ -2928,7 +2945,7 @@
                 <w:b w:val="0"/>
                 <w:sz w:val="20"/>
               </w:rPr>
-              <w:t>—</w:t>
+              <w:t>Ninguno</w:t>
             </w:r>
           </w:p>
         </w:tc>
@@ -3023,7 +3040,7 @@
                 <w:b w:val="0"/>
                 <w:sz w:val="20"/>
               </w:rPr>
-              <w:t>—</w:t>
+              <w:t>Ninguno</w:t>
             </w:r>
           </w:p>
         </w:tc>
@@ -3118,7 +3135,7 @@
                 <w:b w:val="0"/>
                 <w:sz w:val="20"/>
               </w:rPr>
-              <w:t>—</w:t>
+              <w:t>Ninguno</w:t>
             </w:r>
           </w:p>
         </w:tc>
@@ -3462,7 +3479,7 @@
         <w:rPr>
           <w:sz w:val="20"/>
         </w:rPr>
-        <w:t>Elaboración propia. Los casos sin actor son casos incluidos: el sistema los ejecuta como parte de otro y nadie los inicia por separado.</w:t>
+        <w:t>Elaboración propia. Los casos sin actor son casos incluidos y el sistema los ejecuta como parte de otro y nadie los inicia por separado.</w:t>
       </w:r>
     </w:p>
     <w:p>
@@ -3478,7 +3495,7 @@
         <w:pageBreakBefore/>
       </w:pPr>
       <w:r>
-        <w:t>4.3 DCU-03 — Gestión de consumo y planes</w:t>
+        <w:t>4.3 DCU-03. Gestión de consumo y planes</w:t>
       </w:r>
     </w:p>
     <w:p>
@@ -3497,6 +3514,7 @@
     </w:p>
     <w:p>
       <w:pPr>
+        <w:keepNext/>
         <w:spacing w:line="480" w:lineRule="auto" w:before="0" w:after="0"/>
         <w:ind w:firstLine="0"/>
         <w:jc w:val="left"/>
@@ -3510,6 +3528,7 @@
     </w:p>
     <w:p>
       <w:pPr>
+        <w:keepNext/>
         <w:spacing w:line="480" w:lineRule="auto" w:before="0" w:after="0"/>
         <w:ind w:firstLine="0"/>
         <w:jc w:val="left"/>
@@ -3519,11 +3538,12 @@
           <w:b w:val="0"/>
           <w:i/>
         </w:rPr>
-        <w:t>Diagrama de casos de uso: gestión de consumo y planes</w:t>
+        <w:t>Diagrama de casos de uso del módulo de gestión de consumo y planes</w:t>
       </w:r>
     </w:p>
     <w:p>
       <w:pPr>
+        <w:keepNext/>
         <w:spacing w:line="480" w:lineRule="auto" w:before="0" w:after="0"/>
         <w:ind w:firstLine="0"/>
         <w:jc w:val="center"/>
@@ -3531,7 +3551,7 @@
       <w:r>
         <w:drawing>
           <wp:inline xmlns:a="http://schemas.openxmlformats.org/drawingml/2006/main" xmlns:pic="http://schemas.openxmlformats.org/drawingml/2006/picture">
-            <wp:extent cx="5943600" cy="2476216"/>
+            <wp:extent cx="5943600" cy="2827042"/>
             <wp:docPr id="4" name="Picture 4"/>
             <wp:cNvGraphicFramePr>
               <a:graphicFrameLocks noChangeAspect="1"/>
@@ -3552,7 +3572,7 @@
                   <pic:spPr>
                     <a:xfrm>
                       <a:off x="0" y="0"/>
-                      <a:ext cx="5943600" cy="2476216"/>
+                      <a:ext cx="5943600" cy="2827042"/>
                     </a:xfrm>
                     <a:prstGeom prst="rect"/>
                   </pic:spPr>
@@ -3592,6 +3612,7 @@
     </w:p>
     <w:p>
       <w:pPr>
+        <w:keepNext/>
         <w:spacing w:line="480" w:lineRule="auto" w:before="0" w:after="0"/>
         <w:ind w:firstLine="0"/>
         <w:jc w:val="left"/>
@@ -3605,6 +3626,7 @@
     </w:p>
     <w:p>
       <w:pPr>
+        <w:keepNext/>
         <w:spacing w:line="480" w:lineRule="auto" w:before="0" w:after="0"/>
         <w:ind w:firstLine="0"/>
         <w:jc w:val="left"/>
@@ -3901,7 +3923,7 @@
                 <w:b w:val="0"/>
                 <w:sz w:val="20"/>
               </w:rPr>
-              <w:t>—</w:t>
+              <w:t>Ninguno</w:t>
             </w:r>
           </w:p>
         </w:tc>
@@ -4186,7 +4208,7 @@
                 <w:b w:val="0"/>
                 <w:sz w:val="20"/>
               </w:rPr>
-              <w:t>—</w:t>
+              <w:t>Ninguno</w:t>
             </w:r>
           </w:p>
         </w:tc>
@@ -4340,7 +4362,7 @@
         <w:rPr>
           <w:sz w:val="20"/>
         </w:rPr>
-        <w:t>Elaboración propia. Los casos sin actor son casos incluidos: el sistema los ejecuta como parte de otro y nadie los inicia por separado.</w:t>
+        <w:t>Elaboración propia. Los casos sin actor son casos incluidos y el sistema los ejecuta como parte de otro y nadie los inicia por separado.</w:t>
       </w:r>
     </w:p>
     <w:p>
@@ -4356,7 +4378,7 @@
         <w:pageBreakBefore/>
       </w:pPr>
       <w:r>
-        <w:t>4.4 DCU-04 — Gestión de facturación y cartera propias</w:t>
+        <w:t>4.4 DCU-04. Gestión de facturación y cartera propias</w:t>
       </w:r>
     </w:p>
     <w:p>
@@ -4370,11 +4392,12 @@
           <w:b w:val="0"/>
           <w:i w:val="0"/>
         </w:rPr>
-        <w:t>Cubre la venta del proveedor: su catálogo de planes, sus clientes, sus facturas y el recaudo. El registro de un pago extiende la actualización del estado porque un abono parcial no siempre cambia el estado de la factura.</w:t>
+        <w:t>Cubre la venta del proveedor, con su catálogo de planes, sus clientes, sus facturas y el recaudo. El registro de un pago extiende la actualización del estado porque un abono parcial no siempre cambia el estado de la factura.</w:t>
       </w:r>
     </w:p>
     <w:p>
       <w:pPr>
+        <w:keepNext/>
         <w:spacing w:line="480" w:lineRule="auto" w:before="0" w:after="0"/>
         <w:ind w:firstLine="0"/>
         <w:jc w:val="left"/>
@@ -4388,6 +4411,7 @@
     </w:p>
     <w:p>
       <w:pPr>
+        <w:keepNext/>
         <w:spacing w:line="480" w:lineRule="auto" w:before="0" w:after="0"/>
         <w:ind w:firstLine="0"/>
         <w:jc w:val="left"/>
@@ -4397,11 +4421,12 @@
           <w:b w:val="0"/>
           <w:i/>
         </w:rPr>
-        <w:t>Diagrama de casos de uso: gestión de facturación y cartera propias</w:t>
+        <w:t>Diagrama de casos de uso del módulo de gestión de facturación y cartera propias</w:t>
       </w:r>
     </w:p>
     <w:p>
       <w:pPr>
+        <w:keepNext/>
         <w:spacing w:line="480" w:lineRule="auto" w:before="0" w:after="0"/>
         <w:ind w:firstLine="0"/>
         <w:jc w:val="center"/>
@@ -4409,7 +4434,7 @@
       <w:r>
         <w:drawing>
           <wp:inline xmlns:a="http://schemas.openxmlformats.org/drawingml/2006/main" xmlns:pic="http://schemas.openxmlformats.org/drawingml/2006/picture">
-            <wp:extent cx="5943600" cy="3736464"/>
+            <wp:extent cx="5943600" cy="4087289"/>
             <wp:docPr id="5" name="Picture 5"/>
             <wp:cNvGraphicFramePr>
               <a:graphicFrameLocks noChangeAspect="1"/>
@@ -4430,7 +4455,7 @@
                   <pic:spPr>
                     <a:xfrm>
                       <a:off x="0" y="0"/>
-                      <a:ext cx="5943600" cy="3736464"/>
+                      <a:ext cx="5943600" cy="4087289"/>
                     </a:xfrm>
                     <a:prstGeom prst="rect"/>
                   </pic:spPr>
@@ -4470,6 +4495,7 @@
     </w:p>
     <w:p>
       <w:pPr>
+        <w:keepNext/>
         <w:spacing w:line="480" w:lineRule="auto" w:before="0" w:after="0"/>
         <w:ind w:firstLine="0"/>
         <w:jc w:val="left"/>
@@ -4483,6 +4509,7 @@
     </w:p>
     <w:p>
       <w:pPr>
+        <w:keepNext/>
         <w:spacing w:line="480" w:lineRule="auto" w:before="0" w:after="0"/>
         <w:ind w:firstLine="0"/>
         <w:jc w:val="left"/>
@@ -5408,7 +5435,7 @@
         <w:rPr>
           <w:sz w:val="20"/>
         </w:rPr>
-        <w:t>Elaboración propia. Los casos sin actor son casos incluidos: el sistema los ejecuta como parte de otro y nadie los inicia por separado.</w:t>
+        <w:t>Elaboración propia. Los casos sin actor son casos incluidos y el sistema los ejecuta como parte de otro y nadie los inicia por separado.</w:t>
       </w:r>
     </w:p>
     <w:p>
@@ -5424,7 +5451,7 @@
         <w:pageBreakBefore/>
       </w:pPr>
       <w:r>
-        <w:t>4.5 DCU-05 — Gestión de reportes y tablero de control</w:t>
+        <w:t>4.5 DCU-05. Gestión de reportes y tablero de control</w:t>
       </w:r>
     </w:p>
     <w:p>
@@ -5443,6 +5470,7 @@
     </w:p>
     <w:p>
       <w:pPr>
+        <w:keepNext/>
         <w:spacing w:line="480" w:lineRule="auto" w:before="0" w:after="0"/>
         <w:ind w:firstLine="0"/>
         <w:jc w:val="left"/>
@@ -5456,6 +5484,7 @@
     </w:p>
     <w:p>
       <w:pPr>
+        <w:keepNext/>
         <w:spacing w:line="480" w:lineRule="auto" w:before="0" w:after="0"/>
         <w:ind w:firstLine="0"/>
         <w:jc w:val="left"/>
@@ -5465,11 +5494,12 @@
           <w:b w:val="0"/>
           <w:i/>
         </w:rPr>
-        <w:t>Diagrama de casos de uso: gestión de reportes y tablero de control</w:t>
+        <w:t>Diagrama de casos de uso del módulo de gestión de reportes y tablero de control</w:t>
       </w:r>
     </w:p>
     <w:p>
       <w:pPr>
+        <w:keepNext/>
         <w:spacing w:line="480" w:lineRule="auto" w:before="0" w:after="0"/>
         <w:ind w:firstLine="0"/>
         <w:jc w:val="center"/>
@@ -5477,7 +5507,7 @@
       <w:r>
         <w:drawing>
           <wp:inline xmlns:a="http://schemas.openxmlformats.org/drawingml/2006/main" xmlns:pic="http://schemas.openxmlformats.org/drawingml/2006/picture">
-            <wp:extent cx="5943600" cy="2278664"/>
+            <wp:extent cx="5943600" cy="2404689"/>
             <wp:docPr id="6" name="Picture 6"/>
             <wp:cNvGraphicFramePr>
               <a:graphicFrameLocks noChangeAspect="1"/>
@@ -5498,7 +5528,7 @@
                   <pic:spPr>
                     <a:xfrm>
                       <a:off x="0" y="0"/>
-                      <a:ext cx="5943600" cy="2278664"/>
+                      <a:ext cx="5943600" cy="2404689"/>
                     </a:xfrm>
                     <a:prstGeom prst="rect"/>
                   </pic:spPr>
@@ -5538,6 +5568,7 @@
     </w:p>
     <w:p>
       <w:pPr>
+        <w:keepNext/>
         <w:spacing w:line="480" w:lineRule="auto" w:before="0" w:after="0"/>
         <w:ind w:firstLine="0"/>
         <w:jc w:val="left"/>
@@ -5551,6 +5582,7 @@
     </w:p>
     <w:p>
       <w:pPr>
+        <w:keepNext/>
         <w:spacing w:line="480" w:lineRule="auto" w:before="0" w:after="0"/>
         <w:ind w:firstLine="0"/>
         <w:jc w:val="left"/>
@@ -5847,7 +5879,7 @@
                 <w:b w:val="0"/>
                 <w:sz w:val="20"/>
               </w:rPr>
-              <w:t>—</w:t>
+              <w:t>Ninguno</w:t>
             </w:r>
           </w:p>
         </w:tc>
@@ -6286,7 +6318,7 @@
         <w:rPr>
           <w:sz w:val="20"/>
         </w:rPr>
-        <w:t>Elaboración propia. Los casos sin actor son casos incluidos: el sistema los ejecuta como parte de otro y nadie los inicia por separado.</w:t>
+        <w:t>Elaboración propia. Los casos sin actor son casos incluidos y el sistema los ejecuta como parte de otro y nadie los inicia por separado.</w:t>
       </w:r>
     </w:p>
     <w:p>
@@ -6302,7 +6334,7 @@
         <w:pageBreakBefore/>
       </w:pPr>
       <w:r>
-        <w:t>4.6 DCU-06 — Gestión de configuración y catálogos</w:t>
+        <w:t>4.6 DCU-06. Gestión de configuración y catálogos</w:t>
       </w:r>
     </w:p>
     <w:p>
@@ -6321,6 +6353,7 @@
     </w:p>
     <w:p>
       <w:pPr>
+        <w:keepNext/>
         <w:spacing w:line="480" w:lineRule="auto" w:before="0" w:after="0"/>
         <w:ind w:firstLine="0"/>
         <w:jc w:val="left"/>
@@ -6334,6 +6367,7 @@
     </w:p>
     <w:p>
       <w:pPr>
+        <w:keepNext/>
         <w:spacing w:line="480" w:lineRule="auto" w:before="0" w:after="0"/>
         <w:ind w:firstLine="0"/>
         <w:jc w:val="left"/>
@@ -6343,11 +6377,12 @@
           <w:b w:val="0"/>
           <w:i/>
         </w:rPr>
-        <w:t>Diagrama de casos de uso: gestión de configuración y catálogos</w:t>
+        <w:t>Diagrama de casos de uso del módulo de gestión de configuración y catálogos</w:t>
       </w:r>
     </w:p>
     <w:p>
       <w:pPr>
+        <w:keepNext/>
         <w:spacing w:line="480" w:lineRule="auto" w:before="0" w:after="0"/>
         <w:ind w:firstLine="0"/>
         <w:jc w:val="center"/>
@@ -6355,7 +6390,7 @@
       <w:r>
         <w:drawing>
           <wp:inline xmlns:a="http://schemas.openxmlformats.org/drawingml/2006/main" xmlns:pic="http://schemas.openxmlformats.org/drawingml/2006/picture">
-            <wp:extent cx="5943600" cy="3845458"/>
+            <wp:extent cx="5943600" cy="4254187"/>
             <wp:docPr id="7" name="Picture 7"/>
             <wp:cNvGraphicFramePr>
               <a:graphicFrameLocks noChangeAspect="1"/>
@@ -6376,7 +6411,7 @@
                   <pic:spPr>
                     <a:xfrm>
                       <a:off x="0" y="0"/>
-                      <a:ext cx="5943600" cy="3845458"/>
+                      <a:ext cx="5943600" cy="4254187"/>
                     </a:xfrm>
                     <a:prstGeom prst="rect"/>
                   </pic:spPr>
@@ -6416,6 +6451,7 @@
     </w:p>
     <w:p>
       <w:pPr>
+        <w:keepNext/>
         <w:spacing w:line="480" w:lineRule="auto" w:before="0" w:after="0"/>
         <w:ind w:firstLine="0"/>
         <w:jc w:val="left"/>
@@ -6429,6 +6465,7 @@
     </w:p>
     <w:p>
       <w:pPr>
+        <w:keepNext/>
         <w:spacing w:line="480" w:lineRule="auto" w:before="0" w:after="0"/>
         <w:ind w:firstLine="0"/>
         <w:jc w:val="left"/>
@@ -7164,7 +7201,7 @@
         <w:rPr>
           <w:sz w:val="20"/>
         </w:rPr>
-        <w:t>Elaboración propia. Los casos sin actor son casos incluidos: el sistema los ejecuta como parte de otro y nadie los inicia por separado.</w:t>
+        <w:t>Elaboración propia. Los casos sin actor son casos incluidos y el sistema los ejecuta como parte de otro y nadie los inicia por separado.</w:t>
       </w:r>
     </w:p>
     <w:p>
@@ -7180,7 +7217,7 @@
         <w:pageBreakBefore/>
       </w:pPr>
       <w:r>
-        <w:t>4.7 DCU-07 — Gestión de seguridad y auditoría</w:t>
+        <w:t>4.7 DCU-07. Gestión de seguridad y auditoría</w:t>
       </w:r>
     </w:p>
     <w:p>
@@ -7194,11 +7231,12 @@
           <w:b w:val="0"/>
           <w:i w:val="0"/>
         </w:rPr>
-        <w:t>El registro en auditoría se modela como caso incluido de las operaciones de escritura: no es una acción que alguien decida ejecutar, sino una consecuencia obligatoria de haber modificado algo.</w:t>
+        <w:t>El registro en auditoría se modela como caso incluido de las operaciones de escritura, porque no es una acción que alguien decida ejecutar, sino una consecuencia obligatoria de haber modificado algo.</w:t>
       </w:r>
     </w:p>
     <w:p>
       <w:pPr>
+        <w:keepNext/>
         <w:spacing w:line="480" w:lineRule="auto" w:before="0" w:after="0"/>
         <w:ind w:firstLine="0"/>
         <w:jc w:val="left"/>
@@ -7212,6 +7250,7 @@
     </w:p>
     <w:p>
       <w:pPr>
+        <w:keepNext/>
         <w:spacing w:line="480" w:lineRule="auto" w:before="0" w:after="0"/>
         <w:ind w:firstLine="0"/>
         <w:jc w:val="left"/>
@@ -7221,11 +7260,12 @@
           <w:b w:val="0"/>
           <w:i/>
         </w:rPr>
-        <w:t>Diagrama de casos de uso: gestión de seguridad y auditoría</w:t>
+        <w:t>Diagrama de casos de uso del módulo de gestión de seguridad y auditoría</w:t>
       </w:r>
     </w:p>
     <w:p>
       <w:pPr>
+        <w:keepNext/>
         <w:spacing w:line="480" w:lineRule="auto" w:before="0" w:after="0"/>
         <w:ind w:firstLine="0"/>
         <w:jc w:val="center"/>
@@ -7233,7 +7273,7 @@
       <w:r>
         <w:drawing>
           <wp:inline xmlns:a="http://schemas.openxmlformats.org/drawingml/2006/main" xmlns:pic="http://schemas.openxmlformats.org/drawingml/2006/picture">
-            <wp:extent cx="5943600" cy="3317517"/>
+            <wp:extent cx="5943600" cy="3664936"/>
             <wp:docPr id="8" name="Picture 8"/>
             <wp:cNvGraphicFramePr>
               <a:graphicFrameLocks noChangeAspect="1"/>
@@ -7254,7 +7294,7 @@
                   <pic:spPr>
                     <a:xfrm>
                       <a:off x="0" y="0"/>
-                      <a:ext cx="5943600" cy="3317517"/>
+                      <a:ext cx="5943600" cy="3664936"/>
                     </a:xfrm>
                     <a:prstGeom prst="rect"/>
                   </pic:spPr>
@@ -7294,6 +7334,7 @@
     </w:p>
     <w:p>
       <w:pPr>
+        <w:keepNext/>
         <w:spacing w:line="480" w:lineRule="auto" w:before="0" w:after="0"/>
         <w:ind w:firstLine="0"/>
         <w:jc w:val="left"/>
@@ -7307,6 +7348,7 @@
     </w:p>
     <w:p>
       <w:pPr>
+        <w:keepNext/>
         <w:spacing w:line="480" w:lineRule="auto" w:before="0" w:after="0"/>
         <w:ind w:firstLine="0"/>
         <w:jc w:val="left"/>
@@ -7983,7 +8025,7 @@
                 <w:b w:val="0"/>
                 <w:sz w:val="20"/>
               </w:rPr>
-              <w:t>—</w:t>
+              <w:t>Ninguno</w:t>
             </w:r>
           </w:p>
         </w:tc>
@@ -8137,7 +8179,7 @@
         <w:rPr>
           <w:sz w:val="20"/>
         </w:rPr>
-        <w:t>Elaboración propia. Los casos sin actor son casos incluidos: el sistema los ejecuta como parte de otro y nadie los inicia por separado.</w:t>
+        <w:t>Elaboración propia. Los casos sin actor son casos incluidos y el sistema los ejecuta como parte de otro y nadie los inicia por separado.</w:t>
       </w:r>
     </w:p>
     <w:p>
@@ -8153,7 +8195,7 @@
         <w:pageBreakBefore/>
       </w:pPr>
       <w:r>
-        <w:t>4.8 DCU-08 — Integración mediante API REST</w:t>
+        <w:t>4.8 DCU-08. Integración mediante API REST</w:t>
       </w:r>
     </w:p>
     <w:p>
@@ -8172,6 +8214,7 @@
     </w:p>
     <w:p>
       <w:pPr>
+        <w:keepNext/>
         <w:spacing w:line="480" w:lineRule="auto" w:before="0" w:after="0"/>
         <w:ind w:firstLine="0"/>
         <w:jc w:val="left"/>
@@ -8185,6 +8228,7 @@
     </w:p>
     <w:p>
       <w:pPr>
+        <w:keepNext/>
         <w:spacing w:line="480" w:lineRule="auto" w:before="0" w:after="0"/>
         <w:ind w:firstLine="0"/>
         <w:jc w:val="left"/>
@@ -8194,11 +8238,12 @@
           <w:b w:val="0"/>
           <w:i/>
         </w:rPr>
-        <w:t>Diagrama de casos de uso: integración mediante API REST</w:t>
+        <w:t>Diagrama de casos de uso del módulo de integración mediante API REST</w:t>
       </w:r>
     </w:p>
     <w:p>
       <w:pPr>
+        <w:keepNext/>
         <w:spacing w:line="480" w:lineRule="auto" w:before="0" w:after="0"/>
         <w:ind w:firstLine="0"/>
         <w:jc w:val="center"/>
@@ -8206,7 +8251,7 @@
       <w:r>
         <w:drawing>
           <wp:inline xmlns:a="http://schemas.openxmlformats.org/drawingml/2006/main" xmlns:pic="http://schemas.openxmlformats.org/drawingml/2006/picture">
-            <wp:extent cx="5943600" cy="2895163"/>
+            <wp:extent cx="5943600" cy="3245989"/>
             <wp:docPr id="9" name="Picture 9"/>
             <wp:cNvGraphicFramePr>
               <a:graphicFrameLocks noChangeAspect="1"/>
@@ -8227,7 +8272,7 @@
                   <pic:spPr>
                     <a:xfrm>
                       <a:off x="0" y="0"/>
-                      <a:ext cx="5943600" cy="2895163"/>
+                      <a:ext cx="5943600" cy="3245989"/>
                     </a:xfrm>
                     <a:prstGeom prst="rect"/>
                   </pic:spPr>
@@ -8267,6 +8312,7 @@
     </w:p>
     <w:p>
       <w:pPr>
+        <w:keepNext/>
         <w:spacing w:line="480" w:lineRule="auto" w:before="0" w:after="0"/>
         <w:ind w:firstLine="0"/>
         <w:jc w:val="left"/>
@@ -8280,6 +8326,7 @@
     </w:p>
     <w:p>
       <w:pPr>
+        <w:keepNext/>
         <w:spacing w:line="480" w:lineRule="auto" w:before="0" w:after="0"/>
         <w:ind w:firstLine="0"/>
         <w:jc w:val="left"/>
@@ -9110,7 +9157,7 @@
         <w:rPr>
           <w:sz w:val="20"/>
         </w:rPr>
-        <w:t>Elaboración propia. Los casos sin actor son casos incluidos: el sistema los ejecuta como parte de otro y nadie los inicia por separado.</w:t>
+        <w:t>Elaboración propia. Los casos sin actor son casos incluidos y el sistema los ejecuta como parte de otro y nadie los inicia por separado.</w:t>
       </w:r>
     </w:p>
     <w:p>
@@ -9140,11 +9187,12 @@
           <w:b w:val="0"/>
           <w:i w:val="0"/>
         </w:rPr>
-        <w:t>La matriz resume en qué casos participa cada actor. Sirve para comprobar dos cosas: que ningún actor quedó sin casos —lo que indicaría un rol declarado pero no utilizado— y que ningún caso quedó sin actor salvo los incluidos, que por definición los ejecuta el sistema.</w:t>
+        <w:t>La matriz resume en qué casos participa cada actor. Sirve para comprobar dos cosas, que ningún actor quedó sin casos, lo que indicaría un rol declarado pero no utilizado, y que ningún caso quedó sin actor salvo los incluidos, que por definición los ejecuta el sistema.</w:t>
       </w:r>
     </w:p>
     <w:p>
       <w:pPr>
+        <w:keepNext/>
         <w:spacing w:line="480" w:lineRule="auto" w:before="0" w:after="0"/>
         <w:ind w:firstLine="0"/>
         <w:jc w:val="left"/>
@@ -9158,6 +9206,7 @@
     </w:p>
     <w:p>
       <w:pPr>
+        <w:keepNext/>
         <w:spacing w:line="480" w:lineRule="auto" w:before="0" w:after="0"/>
         <w:ind w:firstLine="0"/>
         <w:jc w:val="left"/>

</xml_diff>